<commit_message>
Finaliza auditoria y documentacion del proyecto
</commit_message>
<xml_diff>
--- a/documentacion/ERS/ERS-Pasteleria-Mil-Sabores-Version-1.docx
+++ b/documentacion/ERS/ERS-Pasteleria-Mil-Sabores-Version-1.docx
@@ -89,7 +89,11 @@
         <w:jc w:val="center"/>
       </w:pPr>
       <w:r>
-        <w:t>Autor: Pablo Acuña Escobar</w:t>
+        <w:t>Autores: Pablo Acuña Escobar</w:t>
+        <w:br/>
+        <w:t>Cristobal Cargnino</w:t>
+        <w:br/>
+        <w:t>Tomas Recabarren</w:t>
       </w:r>
     </w:p>
     <w:p>
@@ -267,6 +271,10 @@
                 <w:szCs w:val="20"/>
               </w:rPr>
               <w:t>Pablo Acuña Escobar</w:t>
+              <w:br/>
+              <w:t>Cristobal Cargnino</w:t>
+              <w:br/>
+              <w:t>Tomas Recabarren</w:t>
             </w:r>
           </w:p>
         </w:tc>

</xml_diff>